<commit_message>
lab2 report mostly done
</commit_message>
<xml_diff>
--- a/Reports/Assignment2_group4_report.docx
+++ b/Reports/Assignment2_group4_report.docx
@@ -50,7 +50,18 @@
           <w:sz w:val="28"/>
           <w:szCs w:val="28"/>
         </w:rPr>
-        <w:t xml:space="preserve">1 </w:t>
+        <w:t>2</w:t>
+      </w:r>
+      <w:r>
+        <w:rPr>
+          <w:rFonts w:ascii="Calibri" w:hAnsi="Calibri" w:cs="Calibri"/>
+          <w:b/>
+          <w:bCs/>
+          <w:color w:val="000000"/>
+          <w:sz w:val="28"/>
+          <w:szCs w:val="28"/>
+        </w:rPr>
+        <w:t xml:space="preserve"> </w:t>
       </w:r>
       <w:r>
         <w:rPr>
@@ -322,7 +333,31 @@
           <w:sz w:val="20"/>
           <w:szCs w:val="20"/>
         </w:rPr>
-        <w:t xml:space="preserve"> If you changed the gcc optimization flags</w:t>
+        <w:t xml:space="preserve"> If you changed the </w:t>
+      </w:r>
+      <w:proofErr w:type="spellStart"/>
+      <w:r>
+        <w:rPr>
+          <w:rFonts w:ascii="Calibri" w:hAnsi="Calibri" w:cs="Calibri"/>
+          <w:bCs/>
+          <w:i/>
+          <w:color w:val="000000"/>
+          <w:sz w:val="20"/>
+          <w:szCs w:val="20"/>
+        </w:rPr>
+        <w:t>gcc</w:t>
+      </w:r>
+      <w:proofErr w:type="spellEnd"/>
+      <w:r>
+        <w:rPr>
+          <w:rFonts w:ascii="Calibri" w:hAnsi="Calibri" w:cs="Calibri"/>
+          <w:bCs/>
+          <w:i/>
+          <w:color w:val="000000"/>
+          <w:sz w:val="20"/>
+          <w:szCs w:val="20"/>
+        </w:rPr>
+        <w:t xml:space="preserve"> optimization flags</w:t>
       </w:r>
       <w:r>
         <w:rPr>
@@ -418,7 +453,31 @@
           <w:sz w:val="20"/>
           <w:szCs w:val="20"/>
         </w:rPr>
-        <w:t xml:space="preserve"> in ms</w:t>
+        <w:t xml:space="preserve"> in </w:t>
+      </w:r>
+      <w:proofErr w:type="spellStart"/>
+      <w:r>
+        <w:rPr>
+          <w:rFonts w:ascii="Calibri" w:hAnsi="Calibri" w:cs="Calibri"/>
+          <w:b/>
+          <w:bCs/>
+          <w:color w:val="000000"/>
+          <w:sz w:val="20"/>
+          <w:szCs w:val="20"/>
+        </w:rPr>
+        <w:t>ms</w:t>
+      </w:r>
+      <w:proofErr w:type="spellEnd"/>
+      <w:r>
+        <w:rPr>
+          <w:rFonts w:ascii="Calibri" w:hAnsi="Calibri" w:cs="Calibri"/>
+          <w:b/>
+          <w:bCs/>
+          <w:color w:val="000000"/>
+          <w:sz w:val="20"/>
+          <w:szCs w:val="20"/>
+        </w:rPr>
+        <w:t xml:space="preserve"> unless specified otherwise</w:t>
       </w:r>
     </w:p>
     <w:p>
@@ -1080,7 +1139,31 @@
                 <w:sz w:val="20"/>
                 <w:szCs w:val="20"/>
               </w:rPr>
-              <w:t>lossless, one frame,           Y</w:t>
+              <w:t xml:space="preserve">lossless, one </w:t>
+            </w:r>
+            <w:proofErr w:type="gramStart"/>
+            <w:r>
+              <w:rPr>
+                <w:rFonts w:asciiTheme="minorHAnsi" w:hAnsiTheme="minorHAnsi" w:cs="Calibri"/>
+                <w:b/>
+                <w:bCs/>
+                <w:color w:val="000000"/>
+                <w:sz w:val="20"/>
+                <w:szCs w:val="20"/>
+              </w:rPr>
+              <w:t xml:space="preserve">frame,   </w:t>
+            </w:r>
+            <w:proofErr w:type="gramEnd"/>
+            <w:r>
+              <w:rPr>
+                <w:rFonts w:asciiTheme="minorHAnsi" w:hAnsiTheme="minorHAnsi" w:cs="Calibri"/>
+                <w:b/>
+                <w:bCs/>
+                <w:color w:val="000000"/>
+                <w:sz w:val="20"/>
+                <w:szCs w:val="20"/>
+              </w:rPr>
+              <w:t xml:space="preserve">        Y</w:t>
             </w:r>
             <w:r>
               <w:rPr>
@@ -1189,8 +1272,21 @@
                 <w:sz w:val="20"/>
                 <w:szCs w:val="20"/>
               </w:rPr>
-              <w:t>lossless, one frame, Cb</w:t>
-            </w:r>
+              <w:t xml:space="preserve">lossless, one frame, </w:t>
+            </w:r>
+            <w:proofErr w:type="spellStart"/>
+            <w:r>
+              <w:rPr>
+                <w:rFonts w:asciiTheme="minorHAnsi" w:hAnsiTheme="minorHAnsi" w:cs="Calibri"/>
+                <w:b/>
+                <w:bCs/>
+                <w:color w:val="000000"/>
+                <w:sz w:val="20"/>
+                <w:szCs w:val="20"/>
+              </w:rPr>
+              <w:t>Cb</w:t>
+            </w:r>
+            <w:proofErr w:type="spellEnd"/>
             <w:r>
               <w:rPr>
                 <w:rFonts w:asciiTheme="minorHAnsi" w:hAnsiTheme="minorHAnsi" w:cs="Calibri"/>
@@ -1437,7 +1533,31 @@
                 <w:sz w:val="20"/>
                 <w:szCs w:val="20"/>
               </w:rPr>
-              <w:t>lossless, one frame,           Y</w:t>
+              <w:t xml:space="preserve">lossless, one </w:t>
+            </w:r>
+            <w:proofErr w:type="gramStart"/>
+            <w:r>
+              <w:rPr>
+                <w:rFonts w:asciiTheme="minorHAnsi" w:hAnsiTheme="minorHAnsi" w:cs="Calibri"/>
+                <w:b/>
+                <w:bCs/>
+                <w:color w:val="000000"/>
+                <w:sz w:val="20"/>
+                <w:szCs w:val="20"/>
+              </w:rPr>
+              <w:t xml:space="preserve">frame,   </w:t>
+            </w:r>
+            <w:proofErr w:type="gramEnd"/>
+            <w:r>
+              <w:rPr>
+                <w:rFonts w:asciiTheme="minorHAnsi" w:hAnsiTheme="minorHAnsi" w:cs="Calibri"/>
+                <w:b/>
+                <w:bCs/>
+                <w:color w:val="000000"/>
+                <w:sz w:val="20"/>
+                <w:szCs w:val="20"/>
+              </w:rPr>
+              <w:t xml:space="preserve">        Y</w:t>
             </w:r>
             <w:r>
               <w:rPr>
@@ -1546,8 +1666,21 @@
                 <w:sz w:val="20"/>
                 <w:szCs w:val="20"/>
               </w:rPr>
-              <w:t>lossless, one frame, Cb</w:t>
-            </w:r>
+              <w:t xml:space="preserve">lossless, one frame, </w:t>
+            </w:r>
+            <w:proofErr w:type="spellStart"/>
+            <w:r>
+              <w:rPr>
+                <w:rFonts w:asciiTheme="minorHAnsi" w:hAnsiTheme="minorHAnsi" w:cs="Calibri"/>
+                <w:b/>
+                <w:bCs/>
+                <w:color w:val="000000"/>
+                <w:sz w:val="20"/>
+                <w:szCs w:val="20"/>
+              </w:rPr>
+              <w:t>Cb</w:t>
+            </w:r>
+            <w:proofErr w:type="spellEnd"/>
             <w:r>
               <w:rPr>
                 <w:rFonts w:asciiTheme="minorHAnsi" w:hAnsiTheme="minorHAnsi" w:cs="Calibri"/>
@@ -1794,7 +1927,31 @@
                 <w:sz w:val="20"/>
                 <w:szCs w:val="20"/>
               </w:rPr>
-              <w:t>lossless, one frame,           Y</w:t>
+              <w:t xml:space="preserve">lossless, one </w:t>
+            </w:r>
+            <w:proofErr w:type="gramStart"/>
+            <w:r>
+              <w:rPr>
+                <w:rFonts w:asciiTheme="minorHAnsi" w:hAnsiTheme="minorHAnsi" w:cs="Calibri"/>
+                <w:b/>
+                <w:bCs/>
+                <w:color w:val="000000"/>
+                <w:sz w:val="20"/>
+                <w:szCs w:val="20"/>
+              </w:rPr>
+              <w:t xml:space="preserve">frame,   </w:t>
+            </w:r>
+            <w:proofErr w:type="gramEnd"/>
+            <w:r>
+              <w:rPr>
+                <w:rFonts w:asciiTheme="minorHAnsi" w:hAnsiTheme="minorHAnsi" w:cs="Calibri"/>
+                <w:b/>
+                <w:bCs/>
+                <w:color w:val="000000"/>
+                <w:sz w:val="20"/>
+                <w:szCs w:val="20"/>
+              </w:rPr>
+              <w:t xml:space="preserve">        Y</w:t>
             </w:r>
             <w:r>
               <w:rPr>
@@ -1903,8 +2060,21 @@
                 <w:sz w:val="20"/>
                 <w:szCs w:val="20"/>
               </w:rPr>
-              <w:t>lossless, one frame, Cb</w:t>
-            </w:r>
+              <w:t xml:space="preserve">lossless, one frame, </w:t>
+            </w:r>
+            <w:proofErr w:type="spellStart"/>
+            <w:r>
+              <w:rPr>
+                <w:rFonts w:asciiTheme="minorHAnsi" w:hAnsiTheme="minorHAnsi" w:cs="Calibri"/>
+                <w:b/>
+                <w:bCs/>
+                <w:color w:val="000000"/>
+                <w:sz w:val="20"/>
+                <w:szCs w:val="20"/>
+              </w:rPr>
+              <w:t>Cb</w:t>
+            </w:r>
+            <w:proofErr w:type="spellEnd"/>
             <w:r>
               <w:rPr>
                 <w:rFonts w:asciiTheme="minorHAnsi" w:hAnsiTheme="minorHAnsi" w:cs="Calibri"/>
@@ -2153,16 +2323,29 @@
                 <w:szCs w:val="20"/>
               </w:rPr>
             </w:pPr>
-            <w:r>
-              <w:rPr>
-                <w:rFonts w:asciiTheme="minorHAnsi" w:hAnsiTheme="minorHAnsi" w:cs="Calibri"/>
-                <w:b/>
-                <w:bCs/>
-                <w:color w:val="000000"/>
-                <w:sz w:val="20"/>
-                <w:szCs w:val="20"/>
-              </w:rPr>
-              <w:t>idct, one color component of one frame</w:t>
+            <w:proofErr w:type="spellStart"/>
+            <w:r>
+              <w:rPr>
+                <w:rFonts w:asciiTheme="minorHAnsi" w:hAnsiTheme="minorHAnsi" w:cs="Calibri"/>
+                <w:b/>
+                <w:bCs/>
+                <w:color w:val="000000"/>
+                <w:sz w:val="20"/>
+                <w:szCs w:val="20"/>
+              </w:rPr>
+              <w:t>idct</w:t>
+            </w:r>
+            <w:proofErr w:type="spellEnd"/>
+            <w:r>
+              <w:rPr>
+                <w:rFonts w:asciiTheme="minorHAnsi" w:hAnsiTheme="minorHAnsi" w:cs="Calibri"/>
+                <w:b/>
+                <w:bCs/>
+                <w:color w:val="000000"/>
+                <w:sz w:val="20"/>
+                <w:szCs w:val="20"/>
+              </w:rPr>
+              <w:t>, one color component of one frame</w:t>
             </w:r>
           </w:p>
         </w:tc>
@@ -2221,23 +2404,8 @@
                 <w:sz w:val="20"/>
                 <w:szCs w:val="20"/>
               </w:rPr>
-              <w:t>27.1</w:t>
-            </w:r>
-          </w:p>
-          <w:p>
-            <w:pPr>
-              <w:autoSpaceDE w:val="0"/>
-              <w:autoSpaceDN w:val="0"/>
-              <w:adjustRightInd w:val="0"/>
-              <w:rPr>
-                <w:rFonts w:asciiTheme="minorHAnsi" w:hAnsiTheme="minorHAnsi" w:cs="Calibri"/>
-                <w:b/>
-                <w:bCs/>
-                <w:color w:val="000000"/>
-                <w:sz w:val="20"/>
-                <w:szCs w:val="20"/>
-              </w:rPr>
-            </w:pPr>
+              <w:t>3.598 us</w:t>
+            </w:r>
           </w:p>
         </w:tc>
       </w:tr>
@@ -2270,7 +2438,7 @@
                 <w:sz w:val="20"/>
                 <w:szCs w:val="20"/>
               </w:rPr>
-              <w:t>ycbcr_to_rgb, one frame</w:t>
+              <w:t>LD1_Cache_Flush</w:t>
             </w:r>
           </w:p>
         </w:tc>
@@ -2329,7 +2497,7 @@
                 <w:sz w:val="20"/>
                 <w:szCs w:val="20"/>
               </w:rPr>
-              <w:t>47.6</w:t>
+              <w:t>24.27 us</w:t>
             </w:r>
           </w:p>
           <w:p>
@@ -2378,8 +2546,224 @@
                 <w:sz w:val="20"/>
                 <w:szCs w:val="20"/>
               </w:rPr>
+              <w:t>LD2_Cache_Flush</w:t>
+            </w:r>
+          </w:p>
+        </w:tc>
+        <w:tc>
+          <w:tcPr>
+            <w:tcW w:w="5670" w:type="dxa"/>
+            <w:gridSpan w:val="2"/>
+            <w:vAlign w:val="center"/>
+          </w:tcPr>
+          <w:p>
+            <w:pPr>
+              <w:autoSpaceDE w:val="0"/>
+              <w:autoSpaceDN w:val="0"/>
+              <w:adjustRightInd w:val="0"/>
+              <w:rPr>
+                <w:rFonts w:asciiTheme="minorHAnsi" w:hAnsiTheme="minorHAnsi" w:cs="Calibri"/>
+                <w:b/>
+                <w:bCs/>
+                <w:color w:val="000000"/>
+                <w:sz w:val="20"/>
+                <w:szCs w:val="20"/>
+              </w:rPr>
+            </w:pPr>
+            <w:r>
+              <w:rPr>
+                <w:rFonts w:asciiTheme="minorHAnsi" w:hAnsiTheme="minorHAnsi" w:cs="Calibri"/>
+                <w:b/>
+                <w:bCs/>
+                <w:color w:val="000000"/>
+                <w:sz w:val="20"/>
+                <w:szCs w:val="20"/>
+              </w:rPr>
+              <w:t>(assuming this is the average run time)</w:t>
+            </w:r>
+          </w:p>
+          <w:p>
+            <w:pPr>
+              <w:autoSpaceDE w:val="0"/>
+              <w:autoSpaceDN w:val="0"/>
+              <w:adjustRightInd w:val="0"/>
+              <w:rPr>
+                <w:rFonts w:asciiTheme="minorHAnsi" w:hAnsiTheme="minorHAnsi" w:cs="Calibri"/>
+                <w:b/>
+                <w:bCs/>
+                <w:color w:val="000000"/>
+                <w:sz w:val="20"/>
+                <w:szCs w:val="20"/>
+              </w:rPr>
+            </w:pPr>
+            <w:r>
+              <w:rPr>
+                <w:rFonts w:asciiTheme="minorHAnsi" w:hAnsiTheme="minorHAnsi" w:cs="Calibri"/>
+                <w:b/>
+                <w:bCs/>
+                <w:color w:val="000000"/>
+                <w:sz w:val="20"/>
+                <w:szCs w:val="20"/>
+              </w:rPr>
+              <w:t>434 us</w:t>
+            </w:r>
+          </w:p>
+        </w:tc>
+      </w:tr>
+      <w:tr>
+        <w:tc>
+          <w:tcPr>
+            <w:tcW w:w="1951" w:type="dxa"/>
+            <w:vAlign w:val="center"/>
+          </w:tcPr>
+          <w:p>
+            <w:pPr>
+              <w:autoSpaceDE w:val="0"/>
+              <w:autoSpaceDN w:val="0"/>
+              <w:adjustRightInd w:val="0"/>
+              <w:rPr>
+                <w:rFonts w:asciiTheme="minorHAnsi" w:hAnsiTheme="minorHAnsi" w:cs="Calibri"/>
+                <w:b/>
+                <w:bCs/>
+                <w:color w:val="000000"/>
+                <w:sz w:val="20"/>
+                <w:szCs w:val="20"/>
+              </w:rPr>
+            </w:pPr>
+            <w:proofErr w:type="spellStart"/>
+            <w:r>
+              <w:rPr>
+                <w:rFonts w:asciiTheme="minorHAnsi" w:hAnsiTheme="minorHAnsi" w:cs="Calibri"/>
+                <w:b/>
+                <w:bCs/>
+                <w:color w:val="000000"/>
+                <w:sz w:val="20"/>
+                <w:szCs w:val="20"/>
+              </w:rPr>
+              <w:t>ycbcr_to_rgb</w:t>
+            </w:r>
+            <w:proofErr w:type="spellEnd"/>
+            <w:r>
+              <w:rPr>
+                <w:rFonts w:asciiTheme="minorHAnsi" w:hAnsiTheme="minorHAnsi" w:cs="Calibri"/>
+                <w:b/>
+                <w:bCs/>
+                <w:color w:val="000000"/>
+                <w:sz w:val="20"/>
+                <w:szCs w:val="20"/>
+              </w:rPr>
+              <w:t>, one frame</w:t>
+            </w:r>
+          </w:p>
+        </w:tc>
+        <w:tc>
+          <w:tcPr>
+            <w:tcW w:w="5670" w:type="dxa"/>
+            <w:gridSpan w:val="2"/>
+            <w:vAlign w:val="center"/>
+          </w:tcPr>
+          <w:p>
+            <w:pPr>
+              <w:autoSpaceDE w:val="0"/>
+              <w:autoSpaceDN w:val="0"/>
+              <w:adjustRightInd w:val="0"/>
+              <w:rPr>
+                <w:rFonts w:asciiTheme="minorHAnsi" w:hAnsiTheme="minorHAnsi" w:cs="Calibri"/>
+                <w:b/>
+                <w:bCs/>
+                <w:color w:val="000000"/>
+                <w:sz w:val="20"/>
+                <w:szCs w:val="20"/>
+              </w:rPr>
+            </w:pPr>
+            <w:r>
+              <w:rPr>
+                <w:rFonts w:asciiTheme="minorHAnsi" w:hAnsiTheme="minorHAnsi" w:cs="Calibri"/>
+                <w:b/>
+                <w:bCs/>
+                <w:color w:val="000000"/>
+                <w:sz w:val="20"/>
+                <w:szCs w:val="20"/>
+              </w:rPr>
+              <w:t>(assuming this is the average run time)</w:t>
+            </w:r>
+          </w:p>
+          <w:p>
+            <w:pPr>
+              <w:autoSpaceDE w:val="0"/>
+              <w:autoSpaceDN w:val="0"/>
+              <w:adjustRightInd w:val="0"/>
+              <w:rPr>
+                <w:rFonts w:asciiTheme="minorHAnsi" w:hAnsiTheme="minorHAnsi" w:cs="Calibri"/>
+                <w:b/>
+                <w:bCs/>
+                <w:color w:val="000000"/>
+                <w:sz w:val="20"/>
+                <w:szCs w:val="20"/>
+              </w:rPr>
+            </w:pPr>
+            <w:r>
+              <w:rPr>
+                <w:rFonts w:asciiTheme="minorHAnsi" w:hAnsiTheme="minorHAnsi" w:cs="Calibri"/>
+                <w:b/>
+                <w:bCs/>
+                <w:color w:val="000000"/>
+                <w:sz w:val="20"/>
+                <w:szCs w:val="20"/>
+              </w:rPr>
+              <w:t>47.6</w:t>
+            </w:r>
+          </w:p>
+          <w:p>
+            <w:pPr>
+              <w:autoSpaceDE w:val="0"/>
+              <w:autoSpaceDN w:val="0"/>
+              <w:adjustRightInd w:val="0"/>
+              <w:rPr>
+                <w:rFonts w:asciiTheme="minorHAnsi" w:hAnsiTheme="minorHAnsi" w:cs="Calibri"/>
+                <w:b/>
+                <w:bCs/>
+                <w:color w:val="000000"/>
+                <w:sz w:val="20"/>
+                <w:szCs w:val="20"/>
+              </w:rPr>
+            </w:pPr>
+          </w:p>
+        </w:tc>
+      </w:tr>
+      <w:tr>
+        <w:tc>
+          <w:tcPr>
+            <w:tcW w:w="1951" w:type="dxa"/>
+            <w:vAlign w:val="center"/>
+          </w:tcPr>
+          <w:p>
+            <w:pPr>
+              <w:autoSpaceDE w:val="0"/>
+              <w:autoSpaceDN w:val="0"/>
+              <w:adjustRightInd w:val="0"/>
+              <w:rPr>
+                <w:rFonts w:asciiTheme="minorHAnsi" w:hAnsiTheme="minorHAnsi" w:cs="Calibri"/>
+                <w:b/>
+                <w:bCs/>
+                <w:color w:val="000000"/>
+                <w:sz w:val="20"/>
+                <w:szCs w:val="20"/>
+              </w:rPr>
+            </w:pPr>
+            <w:proofErr w:type="spellStart"/>
+            <w:r>
+              <w:rPr>
+                <w:rFonts w:asciiTheme="minorHAnsi" w:hAnsiTheme="minorHAnsi" w:cs="Calibri"/>
+                <w:b/>
+                <w:bCs/>
+                <w:color w:val="000000"/>
+                <w:sz w:val="20"/>
+                <w:szCs w:val="20"/>
+              </w:rPr>
               <w:t>buff_reg</w:t>
             </w:r>
+            <w:proofErr w:type="spellEnd"/>
           </w:p>
         </w:tc>
         <w:tc>
@@ -2495,78 +2879,6 @@
         <w:tab/>
         <w:t xml:space="preserve"> </w:t>
       </w:r>
-      <w:r>
-        <w:rPr>
-          <w:rFonts w:ascii="Calibri" w:hAnsi="Calibri" w:cs="Calibri"/>
-          <w:b/>
-          <w:bCs/>
-          <w:color w:val="000000"/>
-          <w:sz w:val="20"/>
-          <w:szCs w:val="20"/>
-          <w:u w:val="single"/>
-        </w:rPr>
-        <w:t>6</w:t>
-      </w:r>
-    </w:p>
-    <w:p>
-      <w:pPr>
-        <w:autoSpaceDE w:val="0"/>
-        <w:autoSpaceDN w:val="0"/>
-        <w:adjustRightInd w:val="0"/>
-        <w:rPr>
-          <w:rFonts w:ascii="Calibri" w:hAnsi="Calibri" w:cs="Calibri"/>
-          <w:b/>
-          <w:bCs/>
-          <w:color w:val="000000"/>
-          <w:sz w:val="20"/>
-          <w:szCs w:val="20"/>
-        </w:rPr>
-      </w:pPr>
-    </w:p>
-    <w:p>
-      <w:pPr>
-        <w:autoSpaceDE w:val="0"/>
-        <w:autoSpaceDN w:val="0"/>
-        <w:adjustRightInd w:val="0"/>
-        <w:rPr>
-          <w:rFonts w:ascii="Calibri" w:hAnsi="Calibri" w:cs="Calibri"/>
-          <w:b/>
-          <w:bCs/>
-          <w:color w:val="000000"/>
-          <w:sz w:val="20"/>
-          <w:szCs w:val="20"/>
-        </w:rPr>
-      </w:pPr>
-    </w:p>
-    <w:p>
-      <w:pPr>
-        <w:autoSpaceDE w:val="0"/>
-        <w:autoSpaceDN w:val="0"/>
-        <w:adjustRightInd w:val="0"/>
-        <w:rPr>
-          <w:rFonts w:ascii="Calibri" w:hAnsi="Calibri" w:cs="Calibri"/>
-          <w:b/>
-          <w:bCs/>
-          <w:color w:val="000000"/>
-          <w:sz w:val="20"/>
-          <w:szCs w:val="20"/>
-        </w:rPr>
-      </w:pPr>
-    </w:p>
-    <w:p>
-      <w:pPr>
-        <w:autoSpaceDE w:val="0"/>
-        <w:autoSpaceDN w:val="0"/>
-        <w:adjustRightInd w:val="0"/>
-        <w:rPr>
-          <w:rFonts w:ascii="Calibri" w:hAnsi="Calibri" w:cs="Calibri"/>
-          <w:b/>
-          <w:bCs/>
-          <w:color w:val="000000"/>
-          <w:sz w:val="20"/>
-          <w:szCs w:val="20"/>
-        </w:rPr>
-      </w:pPr>
     </w:p>
     <w:p>
       <w:pPr>
@@ -3223,7 +3535,31 @@
                 <w:sz w:val="20"/>
                 <w:szCs w:val="20"/>
               </w:rPr>
-              <w:t>lossless, one frame,           Y</w:t>
+              <w:t xml:space="preserve">lossless, one </w:t>
+            </w:r>
+            <w:proofErr w:type="gramStart"/>
+            <w:r>
+              <w:rPr>
+                <w:rFonts w:asciiTheme="minorHAnsi" w:hAnsiTheme="minorHAnsi" w:cs="Calibri"/>
+                <w:b/>
+                <w:bCs/>
+                <w:color w:val="000000"/>
+                <w:sz w:val="20"/>
+                <w:szCs w:val="20"/>
+              </w:rPr>
+              <w:t xml:space="preserve">frame,   </w:t>
+            </w:r>
+            <w:proofErr w:type="gramEnd"/>
+            <w:r>
+              <w:rPr>
+                <w:rFonts w:asciiTheme="minorHAnsi" w:hAnsiTheme="minorHAnsi" w:cs="Calibri"/>
+                <w:b/>
+                <w:bCs/>
+                <w:color w:val="000000"/>
+                <w:sz w:val="20"/>
+                <w:szCs w:val="20"/>
+              </w:rPr>
+              <w:t xml:space="preserve">        Y</w:t>
             </w:r>
           </w:p>
         </w:tc>
@@ -3290,8 +3626,21 @@
                 <w:sz w:val="20"/>
                 <w:szCs w:val="20"/>
               </w:rPr>
-              <w:t>lossless, one frame, Cb</w:t>
-            </w:r>
+              <w:t xml:space="preserve">lossless, one frame, </w:t>
+            </w:r>
+            <w:proofErr w:type="spellStart"/>
+            <w:r>
+              <w:rPr>
+                <w:rFonts w:asciiTheme="minorHAnsi" w:hAnsiTheme="minorHAnsi" w:cs="Calibri"/>
+                <w:b/>
+                <w:bCs/>
+                <w:color w:val="000000"/>
+                <w:sz w:val="20"/>
+                <w:szCs w:val="20"/>
+              </w:rPr>
+              <w:t>Cb</w:t>
+            </w:r>
+            <w:proofErr w:type="spellEnd"/>
           </w:p>
         </w:tc>
         <w:tc>
@@ -3445,16 +3794,29 @@
                 <w:szCs w:val="20"/>
               </w:rPr>
             </w:pPr>
-            <w:r>
-              <w:rPr>
-                <w:rFonts w:asciiTheme="minorHAnsi" w:hAnsiTheme="minorHAnsi" w:cs="Calibri"/>
-                <w:b/>
-                <w:bCs/>
-                <w:color w:val="000000"/>
-                <w:sz w:val="20"/>
-                <w:szCs w:val="20"/>
-              </w:rPr>
-              <w:t xml:space="preserve">idct, one </w:t>
+            <w:proofErr w:type="spellStart"/>
+            <w:r>
+              <w:rPr>
+                <w:rFonts w:asciiTheme="minorHAnsi" w:hAnsiTheme="minorHAnsi" w:cs="Calibri"/>
+                <w:b/>
+                <w:bCs/>
+                <w:color w:val="000000"/>
+                <w:sz w:val="20"/>
+                <w:szCs w:val="20"/>
+              </w:rPr>
+              <w:t>idct</w:t>
+            </w:r>
+            <w:proofErr w:type="spellEnd"/>
+            <w:r>
+              <w:rPr>
+                <w:rFonts w:asciiTheme="minorHAnsi" w:hAnsiTheme="minorHAnsi" w:cs="Calibri"/>
+                <w:b/>
+                <w:bCs/>
+                <w:color w:val="000000"/>
+                <w:sz w:val="20"/>
+                <w:szCs w:val="20"/>
+              </w:rPr>
+              <w:t xml:space="preserve">, one </w:t>
             </w:r>
             <w:r>
               <w:rPr>
@@ -3498,23 +3860,8 @@
                 <w:sz w:val="20"/>
                 <w:szCs w:val="20"/>
               </w:rPr>
-              <w:t>76</w:t>
-            </w:r>
-          </w:p>
-          <w:p>
-            <w:pPr>
-              <w:autoSpaceDE w:val="0"/>
-              <w:autoSpaceDN w:val="0"/>
-              <w:adjustRightInd w:val="0"/>
-              <w:rPr>
-                <w:rFonts w:asciiTheme="minorHAnsi" w:hAnsiTheme="minorHAnsi" w:cs="Calibri"/>
-                <w:b/>
-                <w:bCs/>
-                <w:color w:val="000000"/>
-                <w:sz w:val="20"/>
-                <w:szCs w:val="20"/>
-              </w:rPr>
-            </w:pPr>
+              <w:t>64</w:t>
+            </w:r>
           </w:p>
         </w:tc>
       </w:tr>
@@ -3538,16 +3885,29 @@
                 <w:szCs w:val="20"/>
               </w:rPr>
             </w:pPr>
-            <w:r>
-              <w:rPr>
-                <w:rFonts w:asciiTheme="minorHAnsi" w:hAnsiTheme="minorHAnsi" w:cs="Calibri"/>
-                <w:b/>
-                <w:bCs/>
-                <w:color w:val="000000"/>
-                <w:sz w:val="20"/>
-                <w:szCs w:val="20"/>
-              </w:rPr>
-              <w:t xml:space="preserve">ycbcr_to_rgb, one </w:t>
+            <w:proofErr w:type="spellStart"/>
+            <w:r>
+              <w:rPr>
+                <w:rFonts w:asciiTheme="minorHAnsi" w:hAnsiTheme="minorHAnsi" w:cs="Calibri"/>
+                <w:b/>
+                <w:bCs/>
+                <w:color w:val="000000"/>
+                <w:sz w:val="20"/>
+                <w:szCs w:val="20"/>
+              </w:rPr>
+              <w:t>ycbcr_to_rgb</w:t>
+            </w:r>
+            <w:proofErr w:type="spellEnd"/>
+            <w:r>
+              <w:rPr>
+                <w:rFonts w:asciiTheme="minorHAnsi" w:hAnsiTheme="minorHAnsi" w:cs="Calibri"/>
+                <w:b/>
+                <w:bCs/>
+                <w:color w:val="000000"/>
+                <w:sz w:val="20"/>
+                <w:szCs w:val="20"/>
+              </w:rPr>
+              <w:t xml:space="preserve">, one </w:t>
             </w:r>
             <w:r>
               <w:rPr>
@@ -5795,6 +6155,7 @@
   <w:style w:type="character" w:default="1" w:styleId="DefaultParagraphFont">
     <w:name w:val="Default Paragraph Font"/>
     <w:uiPriority w:val="1"/>
+    <w:semiHidden/>
     <w:unhideWhenUsed/>
   </w:style>
   <w:style w:type="table" w:default="1" w:styleId="TableNormal">

</xml_diff>